<commit_message>
Components & HTL Interview QA
</commit_message>
<xml_diff>
--- a/Interview Guide/AEM Cheat Sheet.docx
+++ b/Interview Guide/AEM Cheat Sheet.docx
@@ -37,51 +37,13 @@
       </w:r>
     </w:p>
     <w:p>
-      <w:proofErr w:type="spellStart"/>
-      <w:proofErr w:type="gramStart"/>
-      <w:r>
-        <w:t>ResourceResolver</w:t>
-      </w:r>
-      <w:proofErr w:type="spellEnd"/>
-      <w:r>
-        <w:t xml:space="preserve">  resolver</w:t>
-      </w:r>
-      <w:proofErr w:type="gramEnd"/>
-      <w:r>
-        <w:t xml:space="preserve"> = </w:t>
-      </w:r>
-      <w:proofErr w:type="spellStart"/>
-      <w:proofErr w:type="gramStart"/>
-      <w:r>
-        <w:t>request.getResourceResolver</w:t>
-      </w:r>
-      <w:proofErr w:type="spellEnd"/>
-      <w:proofErr w:type="gramEnd"/>
-      <w:r>
-        <w:t>();</w:t>
+      <w:r>
+        <w:t>ResourceResolver  resolver = request.getResourceResolver();</w:t>
       </w:r>
     </w:p>
     <w:p>
       <w:r>
-        <w:t xml:space="preserve">Resource </w:t>
-      </w:r>
-      <w:proofErr w:type="spellStart"/>
-      <w:r>
-        <w:t>resource</w:t>
-      </w:r>
-      <w:proofErr w:type="spellEnd"/>
-      <w:r>
-        <w:t xml:space="preserve"> = </w:t>
-      </w:r>
-      <w:proofErr w:type="spellStart"/>
-      <w:proofErr w:type="gramStart"/>
-      <w:r>
-        <w:t>resolver.getResource</w:t>
-      </w:r>
-      <w:proofErr w:type="spellEnd"/>
-      <w:proofErr w:type="gramEnd"/>
-      <w:r>
-        <w:t>(“/content/we-retail”);</w:t>
+        <w:t>Resource resource = resolver.getResource(“/content/we-retail”);</w:t>
       </w:r>
     </w:p>
     <w:p/>
@@ -102,62 +64,12 @@
     </w:p>
     <w:p>
       <w:r>
-        <w:t xml:space="preserve">Session </w:t>
-      </w:r>
-      <w:proofErr w:type="spellStart"/>
-      <w:r>
-        <w:t>session</w:t>
-      </w:r>
-      <w:proofErr w:type="spellEnd"/>
-      <w:r>
-        <w:t xml:space="preserve"> = </w:t>
-      </w:r>
-      <w:proofErr w:type="spellStart"/>
-      <w:proofErr w:type="gramStart"/>
-      <w:r>
-        <w:t>resolver.adaptTo</w:t>
-      </w:r>
-      <w:proofErr w:type="spellEnd"/>
-      <w:proofErr w:type="gramEnd"/>
-      <w:r>
-        <w:t>(</w:t>
-      </w:r>
-      <w:proofErr w:type="spellStart"/>
-      <w:r>
-        <w:t>Session.class</w:t>
-      </w:r>
-      <w:proofErr w:type="spellEnd"/>
-      <w:r>
-        <w:t>);</w:t>
+        <w:t>Session session = resolver.adaptTo(Session.class);</w:t>
       </w:r>
     </w:p>
     <w:p>
       <w:r>
-        <w:t xml:space="preserve">Node </w:t>
-      </w:r>
-      <w:proofErr w:type="spellStart"/>
-      <w:r>
-        <w:t>node</w:t>
-      </w:r>
-      <w:proofErr w:type="spellEnd"/>
-      <w:r>
-        <w:t xml:space="preserve"> = </w:t>
-      </w:r>
-      <w:proofErr w:type="spellStart"/>
-      <w:proofErr w:type="gramStart"/>
-      <w:r>
-        <w:t>session.getNode</w:t>
-      </w:r>
-      <w:proofErr w:type="spellEnd"/>
-      <w:proofErr w:type="gramEnd"/>
-      <w:r>
-        <w:t>(</w:t>
-      </w:r>
-      <w:r>
-        <w:t>(“/content/we-retail”</w:t>
-      </w:r>
-      <w:r>
-        <w:t>);</w:t>
+        <w:t>Node node = session.getNode((“/content/we-retail”);</w:t>
       </w:r>
     </w:p>
     <w:p/>
@@ -173,52 +85,12 @@
           <w:b/>
           <w:bCs/>
         </w:rPr>
-        <w:t xml:space="preserve">A </w:t>
-      </w:r>
-      <w:proofErr w:type="spellStart"/>
-      <w:r>
-        <w:rPr>
-          <w:b/>
-          <w:bCs/>
-        </w:rPr>
-        <w:t>ResourceResolver</w:t>
-      </w:r>
-      <w:proofErr w:type="spellEnd"/>
-      <w:r>
-        <w:rPr>
-          <w:b/>
-          <w:bCs/>
-        </w:rPr>
-        <w:t xml:space="preserve"> can be converted into a Session:</w:t>
+        <w:t>A ResourceResolver can be converted into a Session:</w:t>
       </w:r>
     </w:p>
     <w:p>
       <w:r>
-        <w:t xml:space="preserve">Session </w:t>
-      </w:r>
-      <w:proofErr w:type="spellStart"/>
-      <w:r>
-        <w:t>session</w:t>
-      </w:r>
-      <w:proofErr w:type="spellEnd"/>
-      <w:r>
-        <w:t xml:space="preserve"> = </w:t>
-      </w:r>
-      <w:proofErr w:type="spellStart"/>
-      <w:r>
-        <w:t>resourceResolver.adaptTo</w:t>
-      </w:r>
-      <w:proofErr w:type="spellEnd"/>
-      <w:r>
-        <w:t>(</w:t>
-      </w:r>
-      <w:proofErr w:type="spellStart"/>
-      <w:r>
-        <w:t>Session.class</w:t>
-      </w:r>
-      <w:proofErr w:type="spellEnd"/>
-      <w:r>
-        <w:t>);</w:t>
+        <w:t>Session session = resourceResolver.adaptTo(Session.class);</w:t>
       </w:r>
     </w:p>
     <w:p>
@@ -238,46 +110,12 @@
     </w:p>
     <w:p>
       <w:r>
-        <w:t xml:space="preserve">Node </w:t>
-      </w:r>
-      <w:proofErr w:type="spellStart"/>
-      <w:r>
-        <w:t>node</w:t>
-      </w:r>
-      <w:proofErr w:type="spellEnd"/>
-      <w:r>
-        <w:t xml:space="preserve"> = </w:t>
-      </w:r>
-      <w:proofErr w:type="spellStart"/>
-      <w:proofErr w:type="gramStart"/>
-      <w:r>
-        <w:t>resource.adaptTo</w:t>
-      </w:r>
-      <w:proofErr w:type="spellEnd"/>
-      <w:proofErr w:type="gramEnd"/>
-      <w:r>
-        <w:t>(</w:t>
-      </w:r>
-      <w:proofErr w:type="spellStart"/>
-      <w:r>
-        <w:t>Node.class</w:t>
-      </w:r>
-      <w:proofErr w:type="spellEnd"/>
-      <w:r>
-        <w:t>);</w:t>
+        <w:t>Node node = resource.adaptTo(Node.class);</w:t>
       </w:r>
     </w:p>
     <w:p>
       <w:r>
-        <w:t xml:space="preserve">This shows that </w:t>
-      </w:r>
-      <w:proofErr w:type="spellStart"/>
-      <w:r>
-        <w:t>ResourceResolver</w:t>
-      </w:r>
-      <w:proofErr w:type="spellEnd"/>
-      <w:r>
-        <w:t xml:space="preserve"> sits on top of the JCR layer.</w:t>
+        <w:t>This shows that ResourceResolver sits on top of the JCR layer.</w:t>
       </w:r>
     </w:p>
     <w:p/>
@@ -519,38 +357,27 @@
             <w:hideMark/>
           </w:tcPr>
           <w:p>
-            <w:proofErr w:type="spellStart"/>
-            <w:proofErr w:type="gramStart"/>
             <w:r>
               <w:t>javax.jcr.Node</w:t>
             </w:r>
-            <w:proofErr w:type="spellEnd"/>
-            <w:proofErr w:type="gramEnd"/>
-          </w:p>
-        </w:tc>
-        <w:tc>
-          <w:tcPr>
-            <w:tcW w:w="0" w:type="auto"/>
-            <w:tcBorders>
-              <w:top w:val="single" w:sz="6" w:space="0" w:color="E6E6E6"/>
-              <w:left w:val="single" w:sz="6" w:space="0" w:color="E6E6E6"/>
-              <w:bottom w:val="single" w:sz="6" w:space="0" w:color="E6E6E6"/>
-              <w:right w:val="single" w:sz="6" w:space="0" w:color="E6E6E6"/>
-            </w:tcBorders>
-            <w:vAlign w:val="center"/>
-            <w:hideMark/>
-          </w:tcPr>
-          <w:p>
-            <w:proofErr w:type="spellStart"/>
-            <w:r>
-              <w:t>org.apache.sling.api.</w:t>
-            </w:r>
-            <w:proofErr w:type="gramStart"/>
-            <w:r>
-              <w:t>resource.Resource</w:t>
-            </w:r>
-            <w:proofErr w:type="spellEnd"/>
-            <w:proofErr w:type="gramEnd"/>
+          </w:p>
+        </w:tc>
+        <w:tc>
+          <w:tcPr>
+            <w:tcW w:w="0" w:type="auto"/>
+            <w:tcBorders>
+              <w:top w:val="single" w:sz="6" w:space="0" w:color="E6E6E6"/>
+              <w:left w:val="single" w:sz="6" w:space="0" w:color="E6E6E6"/>
+              <w:bottom w:val="single" w:sz="6" w:space="0" w:color="E6E6E6"/>
+              <w:right w:val="single" w:sz="6" w:space="0" w:color="E6E6E6"/>
+            </w:tcBorders>
+            <w:vAlign w:val="center"/>
+            <w:hideMark/>
+          </w:tcPr>
+          <w:p>
+            <w:r>
+              <w:t>org.apache.sling.api.resource.Resource</w:t>
+            </w:r>
           </w:p>
         </w:tc>
       </w:tr>
@@ -766,18 +593,8 @@
             <w:hideMark/>
           </w:tcPr>
           <w:p>
-            <w:proofErr w:type="spellStart"/>
-            <w:proofErr w:type="gramStart"/>
-            <w:r>
-              <w:t>getProperty</w:t>
-            </w:r>
-            <w:proofErr w:type="spellEnd"/>
-            <w:r>
-              <w:t>(</w:t>
-            </w:r>
-            <w:proofErr w:type="gramEnd"/>
-            <w:r>
-              <w:t>)</w:t>
+            <w:r>
+              <w:t>getProperty()</w:t>
             </w:r>
           </w:p>
         </w:tc>
@@ -1642,45 +1459,8 @@
                 <w:lang w:eastAsia="en-IN"/>
                 <w14:ligatures w14:val="none"/>
               </w:rPr>
-              <w:t>/</w:t>
-            </w:r>
-            <w:proofErr w:type="spellStart"/>
-            <w:r>
-              <w:rPr>
-                <w:rFonts w:ascii="Courier New" w:eastAsia="Times New Roman" w:hAnsi="Courier New" w:cs="Courier New"/>
-                <w:kern w:val="0"/>
-                <w:sz w:val="20"/>
-                <w:szCs w:val="20"/>
-                <w:lang w:eastAsia="en-IN"/>
-                <w14:ligatures w14:val="none"/>
-              </w:rPr>
-              <w:t>crx</w:t>
-            </w:r>
-            <w:proofErr w:type="spellEnd"/>
-            <w:r>
-              <w:rPr>
-                <w:rFonts w:ascii="Courier New" w:eastAsia="Times New Roman" w:hAnsi="Courier New" w:cs="Courier New"/>
-                <w:kern w:val="0"/>
-                <w:sz w:val="20"/>
-                <w:szCs w:val="20"/>
-                <w:lang w:eastAsia="en-IN"/>
-                <w14:ligatures w14:val="none"/>
-              </w:rPr>
-              <w:t>/</w:t>
-            </w:r>
-            <w:proofErr w:type="spellStart"/>
-            <w:r>
-              <w:rPr>
-                <w:rFonts w:ascii="Courier New" w:eastAsia="Times New Roman" w:hAnsi="Courier New" w:cs="Courier New"/>
-                <w:kern w:val="0"/>
-                <w:sz w:val="20"/>
-                <w:szCs w:val="20"/>
-                <w:lang w:eastAsia="en-IN"/>
-                <w14:ligatures w14:val="none"/>
-              </w:rPr>
-              <w:t>packmgr</w:t>
-            </w:r>
-            <w:proofErr w:type="spellEnd"/>
+              <w:t>/crx/packmgr</w:t>
+            </w:r>
           </w:p>
         </w:tc>
       </w:tr>
@@ -1827,23 +1607,7 @@
           <w:b/>
           <w:bCs/>
         </w:rPr>
-        <w:t xml:space="preserve">6. Explain </w:t>
-      </w:r>
-      <w:proofErr w:type="spellStart"/>
-      <w:r>
-        <w:rPr>
-          <w:b/>
-          <w:bCs/>
-        </w:rPr>
-        <w:t>ResourceResolver</w:t>
-      </w:r>
-      <w:proofErr w:type="spellEnd"/>
-      <w:r>
-        <w:rPr>
-          <w:b/>
-          <w:bCs/>
-        </w:rPr>
-        <w:t xml:space="preserve"> and Session. Which should be preferred and why?</w:t>
+        <w:t>6. Explain ResourceResolver and Session. Which should be preferred and why?</w:t>
       </w:r>
     </w:p>
     <w:p>
@@ -1967,7 +1731,6 @@
                 <w14:ligatures w14:val="none"/>
               </w:rPr>
             </w:pPr>
-            <w:proofErr w:type="spellStart"/>
             <w:r>
               <w:rPr>
                 <w:rFonts w:ascii="Times New Roman" w:eastAsia="Times New Roman" w:hAnsi="Times New Roman" w:cs="Times New Roman"/>
@@ -1981,7 +1744,6 @@
               </w:rPr>
               <w:t>ResourceResolver</w:t>
             </w:r>
-            <w:proofErr w:type="spellEnd"/>
           </w:p>
         </w:tc>
         <w:tc>
@@ -2835,31 +2597,7 @@
                 <w:lang w:eastAsia="en-IN"/>
                 <w14:ligatures w14:val="none"/>
               </w:rPr>
-              <w:t xml:space="preserve">Cannot adapt to </w:t>
-            </w:r>
-            <w:proofErr w:type="spellStart"/>
-            <w:r>
-              <w:rPr>
-                <w:rFonts w:ascii="Times New Roman" w:eastAsia="Times New Roman" w:hAnsi="Times New Roman" w:cs="Times New Roman"/>
-                <w:kern w:val="0"/>
-                <w:sz w:val="24"/>
-                <w:szCs w:val="24"/>
-                <w:lang w:eastAsia="en-IN"/>
-                <w14:ligatures w14:val="none"/>
-              </w:rPr>
-              <w:t>ResourceResolver</w:t>
-            </w:r>
-            <w:proofErr w:type="spellEnd"/>
-            <w:r>
-              <w:rPr>
-                <w:rFonts w:ascii="Times New Roman" w:eastAsia="Times New Roman" w:hAnsi="Times New Roman" w:cs="Times New Roman"/>
-                <w:kern w:val="0"/>
-                <w:sz w:val="24"/>
-                <w:szCs w:val="24"/>
-                <w:lang w:eastAsia="en-IN"/>
-                <w14:ligatures w14:val="none"/>
-              </w:rPr>
-              <w:t xml:space="preserve"> directly</w:t>
+              <w:t>Cannot adapt to ResourceResolver directly</w:t>
             </w:r>
           </w:p>
         </w:tc>
@@ -2867,7 +2605,295 @@
     </w:tbl>
     <w:p/>
     <w:p/>
-    <w:p/>
+    <w:p>
+      <w:r>
+        <w:t xml:space="preserve">Hi Everyone, I am currently </w:t>
+      </w:r>
+      <w:r>
+        <w:rPr>
+          <w:b/>
+          <w:bCs/>
+        </w:rPr>
+        <w:t>looking for a project opportunity</w:t>
+      </w:r>
+      <w:r>
+        <w:t>. I am fully available to join immediately and ready to upskill myself based on project requirements.</w:t>
+      </w:r>
+      <w:r>
+        <w:br/>
+      </w:r>
+      <w:r>
+        <w:rPr>
+          <w:b/>
+          <w:bCs/>
+        </w:rPr>
+        <w:t>Profile Summary:</w:t>
+      </w:r>
+      <w:r>
+        <w:br/>
+      </w:r>
+      <w:r>
+        <w:rPr>
+          <w:b/>
+          <w:bCs/>
+        </w:rPr>
+        <w:t>Total Experience:</w:t>
+      </w:r>
+      <w:r>
+        <w:t xml:space="preserve"> 4+ years</w:t>
+      </w:r>
+      <w:r>
+        <w:br/>
+      </w:r>
+      <w:r>
+        <w:rPr>
+          <w:b/>
+          <w:bCs/>
+        </w:rPr>
+        <w:t>Designation:</w:t>
+      </w:r>
+      <w:r>
+        <w:t xml:space="preserve"> Associate</w:t>
+      </w:r>
+      <w:r>
+        <w:br/>
+      </w:r>
+      <w:r>
+        <w:rPr>
+          <w:b/>
+          <w:bCs/>
+        </w:rPr>
+        <w:t>Employee ID:</w:t>
+      </w:r>
+      <w:r>
+        <w:t xml:space="preserve"> </w:t>
+      </w:r>
+      <w:r>
+        <w:t>2081126</w:t>
+      </w:r>
+      <w:r>
+        <w:br/>
+      </w:r>
+      <w:r>
+        <w:rPr>
+          <w:b/>
+          <w:bCs/>
+        </w:rPr>
+        <w:t>Location:</w:t>
+      </w:r>
+      <w:r>
+        <w:t xml:space="preserve"> </w:t>
+      </w:r>
+      <w:r>
+        <w:t>Hyderabad</w:t>
+      </w:r>
+      <w:r>
+        <w:br/>
+      </w:r>
+      <w:r>
+        <w:rPr>
+          <w:b/>
+          <w:bCs/>
+        </w:rPr>
+        <w:t>Availability:</w:t>
+      </w:r>
+      <w:r>
+        <w:t xml:space="preserve"> Immediate </w:t>
+      </w:r>
+      <w:r>
+        <w:br/>
+      </w:r>
+      <w:r>
+        <w:rPr>
+          <w:b/>
+          <w:bCs/>
+        </w:rPr>
+        <w:t>Role:</w:t>
+      </w:r>
+      <w:r>
+        <w:rPr>
+          <w:b/>
+          <w:bCs/>
+        </w:rPr>
+        <w:t xml:space="preserve"> </w:t>
+      </w:r>
+      <w:r>
+        <w:t>AEM</w:t>
+      </w:r>
+      <w:r>
+        <w:t xml:space="preserve"> Developer</w:t>
+      </w:r>
+      <w:r>
+        <w:t>, AEM Authoring</w:t>
+      </w:r>
+      <w:r>
+        <w:br/>
+      </w:r>
+      <w:r>
+        <w:rPr>
+          <w:b/>
+          <w:bCs/>
+        </w:rPr>
+        <w:t>Technical Skill Set:</w:t>
+      </w:r>
+      <w:r>
+        <w:br/>
+      </w:r>
+      <w:r>
+        <w:rPr>
+          <w:b/>
+          <w:bCs/>
+        </w:rPr>
+        <w:t>Web Technologies:</w:t>
+      </w:r>
+      <w:r>
+        <w:t> </w:t>
+      </w:r>
+      <w:r>
+        <w:t xml:space="preserve">AEM, </w:t>
+      </w:r>
+      <w:r>
+        <w:t>HTML4/5, CSS2/3, SCSS, JavaScript, JQUERY, JSON, Bootstrap, ReactJs</w:t>
+      </w:r>
+      <w:r>
+        <w:t>.</w:t>
+      </w:r>
+      <w:r>
+        <w:br/>
+      </w:r>
+      <w:r>
+        <w:rPr>
+          <w:b/>
+          <w:bCs/>
+        </w:rPr>
+        <w:t>Database:</w:t>
+      </w:r>
+      <w:r>
+        <w:t>  MS SQL Server</w:t>
+      </w:r>
+      <w:r>
+        <w:br/>
+      </w:r>
+      <w:r>
+        <w:rPr>
+          <w:b/>
+          <w:bCs/>
+        </w:rPr>
+        <w:t>Operating:</w:t>
+      </w:r>
+      <w:r>
+        <w:t> Windows (vista/9x/NT/XP), Win 7</w:t>
+      </w:r>
+      <w:r>
+        <w:br/>
+      </w:r>
+      <w:r>
+        <w:rPr>
+          <w:b/>
+          <w:bCs/>
+        </w:rPr>
+        <w:t>Developer Tools:</w:t>
+      </w:r>
+      <w:r>
+        <w:t> Eclipse,</w:t>
+      </w:r>
+      <w:r>
+        <w:t xml:space="preserve"> IntelliJ</w:t>
+      </w:r>
+      <w:r>
+        <w:t>, MS Office, Excel , Visual Studio</w:t>
+      </w:r>
+      <w:r>
+        <w:br/>
+      </w:r>
+      <w:r>
+        <w:rPr>
+          <w:b/>
+          <w:bCs/>
+        </w:rPr>
+        <w:t>Browser:</w:t>
+      </w:r>
+      <w:r>
+        <w:t> IE6, 7 &amp; 8, Firefox, Opera, Chrome , Safari</w:t>
+      </w:r>
+      <w:r>
+        <w:br/>
+      </w:r>
+      <w:r>
+        <w:rPr>
+          <w:b/>
+          <w:bCs/>
+        </w:rPr>
+        <w:lastRenderedPageBreak/>
+        <w:t>Tools</w:t>
+      </w:r>
+      <w:r>
+        <w:t>: JIRA, GIT, SVN or TFS, Sonar, Github, Agile Methodology, Checkmarx</w:t>
+      </w:r>
+      <w:r>
+        <w:br/>
+      </w:r>
+      <w:r>
+        <w:br/>
+        <w:t>I would greatly appreciate it if you could consider me for any suitable openings or refer me to relevant opportunities. Your support in helping me get assigned to a project at the earliest would be highly valuable.</w:t>
+      </w:r>
+      <w:r>
+        <w:br/>
+      </w:r>
+      <w:r>
+        <w:br/>
+      </w:r>
+      <w:r>
+        <w:rPr>
+          <w:b/>
+          <w:bCs/>
+        </w:rPr>
+        <w:t>Contact Details:</w:t>
+      </w:r>
+      <w:r>
+        <w:br/>
+        <w:t xml:space="preserve">Email: </w:t>
+      </w:r>
+      <w:hyperlink r:id="rId4" w:history="1">
+        <w:r>
+          <w:rPr>
+            <w:rStyle w:val="Hyperlink"/>
+          </w:rPr>
+          <w:t>marennagari.vardhan@cognizant.com</w:t>
+        </w:r>
+      </w:hyperlink>
+      <w:r>
+        <w:br/>
+        <w:t xml:space="preserve">Phone: </w:t>
+      </w:r>
+      <w:r>
+        <w:rPr>
+          <w:u w:val="single"/>
+        </w:rPr>
+        <w:t>9701463242</w:t>
+      </w:r>
+      <w:r>
+        <w:br/>
+      </w:r>
+      <w:r>
+        <w:br/>
+        <w:t>Thank you in advance for your support.</w:t>
+      </w:r>
+      <w:r>
+        <w:br/>
+        <w:t>Best regards,</w:t>
+      </w:r>
+      <w:r>
+        <w:br/>
+      </w:r>
+      <w:r>
+        <w:rPr>
+          <w:b/>
+          <w:bCs/>
+        </w:rPr>
+        <w:t>M Yashwanth Vardhan</w:t>
+      </w:r>
+    </w:p>
     <w:sectPr>
       <w:pgSz w:w="11906" w:h="16838"/>
       <w:pgMar w:top="1440" w:right="1440" w:bottom="1440" w:left="1440" w:header="708" w:footer="708" w:gutter="0"/>
@@ -3481,7 +3507,6 @@
   <w:style w:type="character" w:default="1" w:styleId="DefaultParagraphFont">
     <w:name w:val="Default Paragraph Font"/>
     <w:uiPriority w:val="1"/>
-    <w:semiHidden/>
     <w:unhideWhenUsed/>
   </w:style>
   <w:style w:type="table" w:default="1" w:styleId="TableNormal">
@@ -3795,6 +3820,29 @@
       <w:spacing w:val="5"/>
     </w:rPr>
   </w:style>
+  <w:style w:type="character" w:styleId="Hyperlink">
+    <w:name w:val="Hyperlink"/>
+    <w:basedOn w:val="DefaultParagraphFont"/>
+    <w:uiPriority w:val="99"/>
+    <w:unhideWhenUsed/>
+    <w:rsid w:val="00C51A4E"/>
+    <w:rPr>
+      <w:color w:val="467886" w:themeColor="hyperlink"/>
+      <w:u w:val="single"/>
+    </w:rPr>
+  </w:style>
+  <w:style w:type="character" w:styleId="UnresolvedMention">
+    <w:name w:val="Unresolved Mention"/>
+    <w:basedOn w:val="DefaultParagraphFont"/>
+    <w:uiPriority w:val="99"/>
+    <w:semiHidden/>
+    <w:unhideWhenUsed/>
+    <w:rsid w:val="00C51A4E"/>
+    <w:rPr>
+      <w:color w:val="605E5C"/>
+      <w:shd w:val="clear" w:color="auto" w:fill="E1DFDD"/>
+    </w:rPr>
+  </w:style>
 </w:styles>
 </file>
 

</xml_diff>